<commit_message>
feat: finalize UI polish and prepare for final presentation
</commit_message>
<xml_diff>
--- a/SmartInterview_Progressive_Updates/03_Research_Paper/SmartInterview_Research_Paper_v2.docx
+++ b/SmartInterview_Progressive_Updates/03_Research_Paper/SmartInterview_Research_Paper_v2.docx
@@ -50,19 +50,19 @@
         <w:rPr>
           <w:b/>
         </w:rPr>
-        <w:t>Vasireddy Vignesh Reddy</w:t>
+        <w:t>Thodsam Srujan</w:t>
       </w:r>
       <w:r>
-        <w:t xml:space="preserve"> (24BD1A665X), </w:t>
+        <w:t xml:space="preserve"> (24BD1A665R), </w:t>
       </w:r>
       <w:r>
         <w:rPr>
           <w:b/>
         </w:rPr>
-        <w:t>Thodsam Srujan</w:t>
+        <w:t>Vasireddy Vignesh Reddy</w:t>
       </w:r>
       <w:r>
-        <w:t xml:space="preserve"> (24BD1A665R),</w:t>
+        <w:t xml:space="preserve"> (24BD1A665X),</w:t>
         <w:br/>
       </w:r>
       <w:r>
@@ -102,13 +102,17 @@
           <w:color w:val="555555"/>
           <w:sz w:val="18"/>
         </w:rPr>
-        <w:t>Department of Computer Science &amp; Engineering</w:t>
+        <w:t>Department of Computer Science and Engineering (AI&amp;ML)</w:t>
         <w:br/>
         <w:t>Keshav Memorial Institute of Technology (KMIT), Hyderabad, Telangana, India</w:t>
         <w:br/>
         <w:t>[Affiliated to Jawaharlal Nehru Technological University Hyderabad (JNTUH)]</w:t>
         <w:br/>
-        <w:t>*Corresponding Author / Faculty Mentor: tvgsridevi@kmit.in | Team Group ID: Team G-1392</w:t>
+        <w:t>Faculty Mentor: Dr. TVG Sridevi* (tvgsridevi@kmit.in)</w:t>
+        <w:br/>
+        <w:t>Project Review Identifier: KR24_SDC-II_III-I_2026 Project Review-I | Date: 24-09-2026</w:t>
+        <w:br/>
+        <w:t>Project: Personalized Technical Interview Preparation in Higher Education (SmartInterview — G-1392)</w:t>
       </w:r>
     </w:p>
     <w:p>
@@ -363,7 +367,7 @@
           <w:color w:val="212121"/>
           <w:sz w:val="20"/>
         </w:rPr>
-        <w:t>A.  Conversational AI in Interview Simulation</w:t>
+        <w:t>A.  Review of Foundational Base Papers</w:t>
       </w:r>
     </w:p>
     <w:p>
@@ -377,7 +381,51 @@
           <w:rFonts w:ascii="Times New Roman" w:hAnsi="Times New Roman"/>
           <w:sz w:val="20"/>
         </w:rPr>
-        <w:t>Recent research has explored the feasibility of conversational agents in mock recruitment. Wahid et al. (IJERT, 2026) introduced an automated mock interview system employing Google Gemini and Whisper speech recognition. While their architecture demonstrated that neural speech interfaces reduce candidate nervousness, their pipeline relied on an ungrounded single-pass prompt architecture without knowledge retrieval, resulting in occasional technical inaccuracies and generic question sets. Similarly, Nagarajan et al. (IJMRR, 2026) presented an AI interview engine using Sentence-BERT to compute semantic matching between candidate resumes and job roles. However, their approach restricted SBERT to initial resume screening rather than utilizing dense embeddings for real-time answer grounding and multi-factor evaluation.</w:t>
+        <w:t>The architectural design of SmartInterview is directly informed by and contextualized against two seminal recent works in AI-assisted technical interview simulation:</w:t>
+      </w:r>
+    </w:p>
+    <w:p>
+      <w:pPr>
+        <w:pStyle w:val="ListBullet"/>
+        <w:spacing w:line="276" w:lineRule="auto" w:before="0" w:after="40"/>
+        <w:jc w:val="both"/>
+      </w:pPr>
+      <w:r>
+        <w:rPr>
+          <w:rFonts w:ascii="Times New Roman" w:hAnsi="Times New Roman"/>
+          <w:b/>
+          <w:sz w:val="20"/>
+        </w:rPr>
+        <w:t xml:space="preserve">Base Paper 1 — Voice-Interactive Interview Simulation (Wahid et al., IJERT 2026): </w:t>
+      </w:r>
+      <w:r>
+        <w:rPr>
+          <w:rFonts w:ascii="Times New Roman" w:hAnsi="Times New Roman"/>
+          <w:sz w:val="20"/>
+        </w:rPr>
+        <w:t>Wahid et al. introduced an AI Mock Interview system utilizing Google Gemini and OpenAI Whisper within a Streamlit web interface [1]. Their work demonstrated that voice-based interaction substantially mitigates student anxiety by simulating realistic conversational cadence, using automatic speech recognition for candidate spoken answers and generating structured performance reports via ReportLab. However, an analysis reveals critical limitations: the system relied on single-pass, ungrounded Gemini generation without external knowledge retrieval, leaving questions susceptible to factual hallucinations; question sequencing followed an unconstrained dialog chain without formal educational scaffolding; and Streamlit's monolithic execution model limited client-side responsiveness.</w:t>
+      </w:r>
+    </w:p>
+    <w:p>
+      <w:pPr>
+        <w:pStyle w:val="ListBullet"/>
+        <w:spacing w:line="276" w:lineRule="auto" w:before="0" w:after="40"/>
+        <w:jc w:val="both"/>
+      </w:pPr>
+      <w:r>
+        <w:rPr>
+          <w:rFonts w:ascii="Times New Roman" w:hAnsi="Times New Roman"/>
+          <w:b/>
+          <w:sz w:val="20"/>
+        </w:rPr>
+        <w:t xml:space="preserve">Base Paper 2 — Autonomous AI Interview Engine using S-BERT (Nagarajan et al., IJMRR 2026): </w:t>
+      </w:r>
+      <w:r>
+        <w:rPr>
+          <w:rFonts w:ascii="Times New Roman" w:hAnsi="Times New Roman"/>
+          <w:sz w:val="20"/>
+        </w:rPr>
+        <w:t>Nagarajan et al. developed an Autonomous AI Interview Engine using Sentence-BERT and Large Language Models for end-to-end candidate evaluation [2]. Their primary contribution proved that dense semantic embeddings generated via Sentence-BERT (S-BERT) dramatically outperform classical keyword matching (TF-IDF) in matching candidate resumes with target job descriptions. They also deployed an LLM-driven multi-turn conversational engine with speech-to-text and text-to-speech. Nonetheless, key gaps remained: S-BERT was restricted exclusively to initial resume screening rather than continuous RAG answer grounding; the system lacked a persistent local vector database for dynamic academic curriculum ingestion; and question generation lacked formal pedagogical state control, treating all topics with uniform cognitive complexity.</w:t>
       </w:r>
     </w:p>
     <w:p>
@@ -883,6 +931,276 @@
                 <w:sz w:val="16"/>
               </w:rPr>
               <w:t>WebRTC Video/Audio</w:t>
+            </w:r>
+          </w:p>
+        </w:tc>
+        <w:tc>
+          <w:tcPr>
+            <w:tcW w:type="dxa" w:w="1419"/>
+            <w:tcMar>
+              <w:top w:w="60" w:type="dxa"/>
+              <w:bottom w:w="60" w:type="dxa"/>
+              <w:left w:w="80" w:type="dxa"/>
+              <w:right w:w="80" w:type="dxa"/>
+            </w:tcMar>
+          </w:tcPr>
+          <w:p>
+            <w:r>
+              <w:rPr>
+                <w:sz w:val="16"/>
+              </w:rPr>
+              <w:t>No</w:t>
+            </w:r>
+          </w:p>
+        </w:tc>
+      </w:tr>
+      <w:tr>
+        <w:tc>
+          <w:tcPr>
+            <w:tcW w:type="dxa" w:w="1419"/>
+            <w:tcMar>
+              <w:top w:w="60" w:type="dxa"/>
+              <w:bottom w:w="60" w:type="dxa"/>
+              <w:left w:w="80" w:type="dxa"/>
+              <w:right w:w="80" w:type="dxa"/>
+            </w:tcMar>
+          </w:tcPr>
+          <w:p>
+            <w:r>
+              <w:rPr>
+                <w:sz w:val="16"/>
+              </w:rPr>
+              <w:t>Wahid et al. (Base Paper 1) [1]</w:t>
+            </w:r>
+          </w:p>
+        </w:tc>
+        <w:tc>
+          <w:tcPr>
+            <w:tcW w:type="dxa" w:w="1419"/>
+            <w:tcMar>
+              <w:top w:w="60" w:type="dxa"/>
+              <w:bottom w:w="60" w:type="dxa"/>
+              <w:left w:w="80" w:type="dxa"/>
+              <w:right w:w="80" w:type="dxa"/>
+            </w:tcMar>
+          </w:tcPr>
+          <w:p>
+            <w:r>
+              <w:rPr>
+                <w:sz w:val="16"/>
+              </w:rPr>
+              <w:t>Voice Web (Streamlit)</w:t>
+            </w:r>
+          </w:p>
+        </w:tc>
+        <w:tc>
+          <w:tcPr>
+            <w:tcW w:type="dxa" w:w="1419"/>
+            <w:tcMar>
+              <w:top w:w="60" w:type="dxa"/>
+              <w:bottom w:w="60" w:type="dxa"/>
+              <w:left w:w="80" w:type="dxa"/>
+              <w:right w:w="80" w:type="dxa"/>
+            </w:tcMar>
+          </w:tcPr>
+          <w:p>
+            <w:r>
+              <w:rPr>
+                <w:sz w:val="16"/>
+              </w:rPr>
+              <w:t>None (Zero-Shot Gemini)</w:t>
+            </w:r>
+          </w:p>
+        </w:tc>
+        <w:tc>
+          <w:tcPr>
+            <w:tcW w:type="dxa" w:w="1419"/>
+            <w:tcMar>
+              <w:top w:w="60" w:type="dxa"/>
+              <w:bottom w:w="60" w:type="dxa"/>
+              <w:left w:w="80" w:type="dxa"/>
+              <w:right w:w="80" w:type="dxa"/>
+            </w:tcMar>
+          </w:tcPr>
+          <w:p>
+            <w:r>
+              <w:rPr>
+                <w:sz w:val="16"/>
+              </w:rPr>
+              <w:t>Unstructured LLM Chain</w:t>
+            </w:r>
+          </w:p>
+        </w:tc>
+        <w:tc>
+          <w:tcPr>
+            <w:tcW w:type="dxa" w:w="1419"/>
+            <w:tcMar>
+              <w:top w:w="60" w:type="dxa"/>
+              <w:bottom w:w="60" w:type="dxa"/>
+              <w:left w:w="80" w:type="dxa"/>
+              <w:right w:w="80" w:type="dxa"/>
+            </w:tcMar>
+          </w:tcPr>
+          <w:p>
+            <w:r>
+              <w:rPr>
+                <w:sz w:val="16"/>
+              </w:rPr>
+              <w:t>Qualitative AI Feedback</w:t>
+            </w:r>
+          </w:p>
+        </w:tc>
+        <w:tc>
+          <w:tcPr>
+            <w:tcW w:type="dxa" w:w="1419"/>
+            <w:tcMar>
+              <w:top w:w="60" w:type="dxa"/>
+              <w:bottom w:w="60" w:type="dxa"/>
+              <w:left w:w="80" w:type="dxa"/>
+              <w:right w:w="80" w:type="dxa"/>
+            </w:tcMar>
+          </w:tcPr>
+          <w:p>
+            <w:r>
+              <w:rPr>
+                <w:sz w:val="16"/>
+              </w:rPr>
+              <w:t>OpenAI Whisper STT</w:t>
+            </w:r>
+          </w:p>
+        </w:tc>
+        <w:tc>
+          <w:tcPr>
+            <w:tcW w:type="dxa" w:w="1419"/>
+            <w:tcMar>
+              <w:top w:w="60" w:type="dxa"/>
+              <w:bottom w:w="60" w:type="dxa"/>
+              <w:left w:w="80" w:type="dxa"/>
+              <w:right w:w="80" w:type="dxa"/>
+            </w:tcMar>
+          </w:tcPr>
+          <w:p>
+            <w:r>
+              <w:rPr>
+                <w:sz w:val="16"/>
+              </w:rPr>
+              <w:t>No</w:t>
+            </w:r>
+          </w:p>
+        </w:tc>
+      </w:tr>
+      <w:tr>
+        <w:tc>
+          <w:tcPr>
+            <w:tcW w:type="dxa" w:w="1419"/>
+            <w:tcMar>
+              <w:top w:w="60" w:type="dxa"/>
+              <w:bottom w:w="60" w:type="dxa"/>
+              <w:left w:w="80" w:type="dxa"/>
+              <w:right w:w="80" w:type="dxa"/>
+            </w:tcMar>
+          </w:tcPr>
+          <w:p>
+            <w:r>
+              <w:rPr>
+                <w:sz w:val="16"/>
+              </w:rPr>
+              <w:t>Nagarajan et al. (Base Paper 2) [2]</w:t>
+            </w:r>
+          </w:p>
+        </w:tc>
+        <w:tc>
+          <w:tcPr>
+            <w:tcW w:type="dxa" w:w="1419"/>
+            <w:tcMar>
+              <w:top w:w="60" w:type="dxa"/>
+              <w:bottom w:w="60" w:type="dxa"/>
+              <w:left w:w="80" w:type="dxa"/>
+              <w:right w:w="80" w:type="dxa"/>
+            </w:tcMar>
+          </w:tcPr>
+          <w:p>
+            <w:r>
+              <w:rPr>
+                <w:sz w:val="16"/>
+              </w:rPr>
+              <w:t>Voice Dialog Pipeline</w:t>
+            </w:r>
+          </w:p>
+        </w:tc>
+        <w:tc>
+          <w:tcPr>
+            <w:tcW w:type="dxa" w:w="1419"/>
+            <w:tcMar>
+              <w:top w:w="60" w:type="dxa"/>
+              <w:bottom w:w="60" w:type="dxa"/>
+              <w:left w:w="80" w:type="dxa"/>
+              <w:right w:w="80" w:type="dxa"/>
+            </w:tcMar>
+          </w:tcPr>
+          <w:p>
+            <w:r>
+              <w:rPr>
+                <w:sz w:val="16"/>
+              </w:rPr>
+              <w:t>None (Zero-Shot LLM)</w:t>
+            </w:r>
+          </w:p>
+        </w:tc>
+        <w:tc>
+          <w:tcPr>
+            <w:tcW w:type="dxa" w:w="1419"/>
+            <w:tcMar>
+              <w:top w:w="60" w:type="dxa"/>
+              <w:bottom w:w="60" w:type="dxa"/>
+              <w:left w:w="80" w:type="dxa"/>
+              <w:right w:w="80" w:type="dxa"/>
+            </w:tcMar>
+          </w:tcPr>
+          <w:p>
+            <w:r>
+              <w:rPr>
+                <w:sz w:val="16"/>
+              </w:rPr>
+              <w:t>Heuristic Time-Module</w:t>
+            </w:r>
+          </w:p>
+        </w:tc>
+        <w:tc>
+          <w:tcPr>
+            <w:tcW w:type="dxa" w:w="1419"/>
+            <w:tcMar>
+              <w:top w:w="60" w:type="dxa"/>
+              <w:bottom w:w="60" w:type="dxa"/>
+              <w:left w:w="80" w:type="dxa"/>
+              <w:right w:w="80" w:type="dxa"/>
+            </w:tcMar>
+          </w:tcPr>
+          <w:p>
+            <w:r>
+              <w:rPr>
+                <w:sz w:val="16"/>
+              </w:rPr>
+              <w:t>Structured LLM Rubric</w:t>
+            </w:r>
+          </w:p>
+        </w:tc>
+        <w:tc>
+          <w:tcPr>
+            <w:tcW w:type="dxa" w:w="1419"/>
+            <w:tcMar>
+              <w:top w:w="60" w:type="dxa"/>
+              <w:bottom w:w="60" w:type="dxa"/>
+              <w:left w:w="80" w:type="dxa"/>
+              <w:right w:w="80" w:type="dxa"/>
+            </w:tcMar>
+          </w:tcPr>
+          <w:p>
+            <w:r>
+              <w:rPr>
+                <w:sz w:val="16"/>
+              </w:rPr>
+              <w:t>STT / TTS Pipeline</w:t>
             </w:r>
           </w:p>
         </w:tc>
@@ -5898,7 +6216,7 @@
           <w:rFonts w:ascii="Times New Roman" w:hAnsi="Times New Roman"/>
           <w:sz w:val="17"/>
         </w:rPr>
-        <w:t>L. W. Anderson and D. R. Krathwohl, A Taxonomy for Learning, Teaching, and Assessing: A Revision of Bloom's Taxonomy of Educational Objectives. New York: Longman, 2001.</w:t>
+        <w:t>A. Wahid, A. Jha, M. Munshi, S. Sonwane, and A. Chakrawarti, 'AI Mock Interview: An Intelligent Voice-Driven Interview Simulation System using Gemini AI and Whisper,' Int. J. Eng. Res. Technol. (IJERT), vol. 15, no. 03, pp. 1-4, Mar. 2026.</w:t>
       </w:r>
     </w:p>
     <w:p>
@@ -5920,7 +6238,7 @@
           <w:rFonts w:ascii="Times New Roman" w:hAnsi="Times New Roman"/>
           <w:sz w:val="17"/>
         </w:rPr>
-        <w:t>B. S. Bloom, Taxonomy of Educational Objectives: The Classification of Educational Goals. Handbook 1: Cognitive Domain. New York: David McKay Co., 1956.</w:t>
+        <w:t>M. K. Nagarajan, A. Kumar, I. V. S. Vignesh, A. Nehal, and M. Musthafa, 'Development of an Autonomous AI Interview Engine Using Sentence-BERT and Large Language Models for End-to-End Candidate Evaluation,' Indian J. Mod. Res. Rev. (IJMRR), vol. 4, no. 2, pp. 33-40, Feb. 2026.</w:t>
       </w:r>
     </w:p>
     <w:p>
@@ -5942,7 +6260,7 @@
           <w:rFonts w:ascii="Times New Roman" w:hAnsi="Times New Roman"/>
           <w:sz w:val="17"/>
         </w:rPr>
-        <w:t>P. Lewis et al., 'Retrieval-augmented generation for knowledge-intensive NLP tasks,' in Advances in Neural Information Processing Systems (NeurIPS), vol. 33, pp. 9459-9474, 2020.</w:t>
+        <w:t>L. W. Anderson and D. R. Krathwohl, A Taxonomy for Learning, Teaching, and Assessing: A Revision of Bloom's Taxonomy of Educational Objectives. New York: Longman, 2001.</w:t>
       </w:r>
     </w:p>
     <w:p>
@@ -5964,7 +6282,7 @@
           <w:rFonts w:ascii="Times New Roman" w:hAnsi="Times New Roman"/>
           <w:sz w:val="17"/>
         </w:rPr>
-        <w:t>N. Reimers and I. Gurevych, 'Sentence-BERT: Sentence embeddings using Siamese BERT-networks,' in Proc. 2019 Conf. Empirical Methods Natural Lang. Process. (EMNLP), pp. 3982-3992, 2019.</w:t>
+        <w:t>B. S. Bloom, Taxonomy of Educational Objectives: The Classification of Educational Goals. Handbook 1: Cognitive Domain. New York: David McKay Co., 1956.</w:t>
       </w:r>
     </w:p>
     <w:p>
@@ -5986,7 +6304,7 @@
           <w:rFonts w:ascii="Times New Roman" w:hAnsi="Times New Roman"/>
           <w:sz w:val="17"/>
         </w:rPr>
-        <w:t>A. Vaswani et al., 'Attention is all you need,' in Advances in Neural Information Processing Systems (NeurIPS), vol. 30, pp. 5998-6008, 2017.</w:t>
+        <w:t>P. Lewis et al., 'Retrieval-augmented generation for knowledge-intensive NLP tasks,' in Advances in Neural Information Processing Systems (NeurIPS), vol. 33, pp. 9459-9474, 2020.</w:t>
       </w:r>
     </w:p>
     <w:p>
@@ -6008,7 +6326,7 @@
           <w:rFonts w:ascii="Times New Roman" w:hAnsi="Times New Roman"/>
           <w:sz w:val="17"/>
         </w:rPr>
-        <w:t>S. Wahid, M. A. Khan, and R. Ahmed, 'Voice-driven automated mock interview simulator using neural language models,' Int. J. Emerg. Res. Technol. (IJERT), vol. 15, no. 2, pp. 112-118, Feb. 2026.</w:t>
+        <w:t>N. Reimers and I. Gurevych, 'Sentence-BERT: Sentence embeddings using Siamese BERT-networks,' in Proc. 2019 Conf. Empirical Methods Natural Lang. Process. (EMNLP), pp. 3982-3992, 2019.</w:t>
       </w:r>
     </w:p>
     <w:p>
@@ -6030,7 +6348,7 @@
           <w:rFonts w:ascii="Times New Roman" w:hAnsi="Times New Roman"/>
           <w:sz w:val="17"/>
         </w:rPr>
-        <w:t>K. Nagarajan, P. Suresh, and V. Swaminathan, 'Autonomous technical screening and resume skill alignment using dense semantic embeddings,' Int. J. Manag. IT Res. (IJMRR), vol. 16, no. 1, pp. 45-53, Jan. 2026.</w:t>
+        <w:t>A. Vaswani et al., 'Attention is all you need,' in Advances in Neural Information Processing Systems (NeurIPS), vol. 30, pp. 5998-6008, 2017.</w:t>
       </w:r>
     </w:p>
     <w:p>

</xml_diff>